<commit_message>
Record the two remedies built and the deploy defect caught
Co-Authored-By: Claude Opus 5 <noreply@anthropic.com>
Claude-Session: https://claude.ai/code/session_01W9UtE7X76spacWeSvBH7tv
</commit_message>
<xml_diff>
--- a/CONVERSION_ARCHITECTURE_BRIEFING.docx
+++ b/CONVERSION_ARCHITECTURE_BRIEFING.docx
@@ -20,6 +20,173 @@
           <w:b/>
         </w:rPr>
         <w:t xml:space="preserve">Prepared 2026-08-14. Every finding checked against the live site and the files on disk.</w:t>
+      </w:r>
+    </w:p>
+    <w:p>
+      <w:pPr>
+        <w:pStyle w:val="Heading2"/>
+        <w:spacing w:after="140"/>
+      </w:pPr>
+      <w:r>
+        <w:t xml:space="preserve">STATUS: the two headline remedies are BUILT AND LIVE</w:t>
+      </w:r>
+    </w:p>
+    <w:tbl>
+      <w:tblPr>
+        <w:tblStyle w:val="TableGrid"/>
+        <w:tblW w:w="9360" w:type="dxa"/>
+        <w:tblBorders>
+          <w:top w:val="single" w:sz="4" w:space="0" w:color="999999"/>
+          <w:left w:val="single" w:sz="4" w:space="0" w:color="999999"/>
+          <w:bottom w:val="single" w:sz="4" w:space="0" w:color="999999"/>
+          <w:right w:val="single" w:sz="4" w:space="0" w:color="999999"/>
+          <w:insideH w:val="single" w:sz="4" w:space="0" w:color="999999"/>
+          <w:insideV w:val="single" w:sz="4" w:space="0" w:color="999999"/>
+        </w:tblBorders>
+      </w:tblPr>
+      <w:tblGrid>
+        <w:gridCol w:w="4680"/>
+        <w:gridCol w:w="4680"/>
+      </w:tblGrid>
+      <w:tr>
+        <w:tc>
+          <w:tcPr>
+            <w:tcW w:w="4680" w:type="dxa"/>
+          </w:tcPr>
+          <w:p>
+            <w:pPr>
+              <w:spacing w:after="0"/>
+            </w:pPr>
+            <w:r>
+              <w:t xml:space="preserve">Remedy</w:t>
+            </w:r>
+          </w:p>
+        </w:tc>
+        <w:tc>
+          <w:tcPr>
+            <w:tcW w:w="4680" w:type="dxa"/>
+          </w:tcPr>
+          <w:p>
+            <w:pPr>
+              <w:spacing w:after="0"/>
+            </w:pPr>
+            <w:r>
+              <w:t xml:space="preserve">State</w:t>
+            </w:r>
+          </w:p>
+        </w:tc>
+      </w:tr>
+      <w:tr>
+        <w:tc>
+          <w:tcPr>
+            <w:tcW w:w="4680" w:type="dxa"/>
+          </w:tcPr>
+          <w:p>
+            <w:pPr>
+              <w:spacing w:after="0"/>
+            </w:pPr>
+            <w:r>
+              <w:t xml:space="preserve">Re-architect the </w:t>
+            </w:r>
+            <w:r>
+              <w:rPr>
+                <w:rFonts w:ascii="Consolas" w:hAnsi="Consolas"/>
+              </w:rPr>
+              <w:t xml:space="preserve">/check.html</w:t>
+            </w:r>
+            <w:r>
+              <w:t xml:space="preserve"> fold</w:t>
+            </w:r>
+          </w:p>
+        </w:tc>
+        <w:tc>
+          <w:tcPr>
+            <w:tcW w:w="4680" w:type="dxa"/>
+          </w:tcPr>
+          <w:p>
+            <w:pPr>
+              <w:spacing w:after="0"/>
+            </w:pPr>
+            <w:r>
+              <w:rPr>
+                <w:b/>
+              </w:rPr>
+              <w:t xml:space="preserve">LIVE.</w:t>
+            </w:r>
+            <w:r>
+              <w:t xml:space="preserve"> Evidence above the modes, caveat below the self-assessment. Verified order on the rendered page: evidence 347px, modes 571px, caveat 2116px</w:t>
+            </w:r>
+          </w:p>
+        </w:tc>
+      </w:tr>
+      <w:tr>
+        <w:tc>
+          <w:tcPr>
+            <w:tcW w:w="4680" w:type="dxa"/>
+          </w:tcPr>
+          <w:p>
+            <w:pPr>
+              <w:spacing w:after="0"/>
+            </w:pPr>
+            <w:r>
+              <w:t xml:space="preserve">Build </w:t>
+            </w:r>
+            <w:r>
+              <w:rPr>
+                <w:rFonts w:ascii="Consolas" w:hAnsi="Consolas"/>
+              </w:rPr>
+              <w:t xml:space="preserve">/engagement.html</w:t>
+            </w:r>
+          </w:p>
+        </w:tc>
+        <w:tc>
+          <w:tcPr>
+            <w:tcW w:w="4680" w:type="dxa"/>
+          </w:tcPr>
+          <w:p>
+            <w:pPr>
+              <w:spacing w:after="0"/>
+            </w:pPr>
+            <w:r>
+              <w:rPr>
+                <w:b/>
+              </w:rPr>
+              <w:t xml:space="preserve">LIVE</w:t>
+            </w:r>
+            <w:r>
+              <w:t xml:space="preserve">, linked from 36 pages</w:t>
+            </w:r>
+          </w:p>
+        </w:tc>
+      </w:tr>
+    </w:tbl>
+    <w:p>
+      <w:pPr/>
+      <w:r>
+        <w:t/>
+      </w:r>
+    </w:p>
+    <w:p>
+      <w:pPr>
+        <w:spacing w:after="140"/>
+      </w:pPr>
+      <w:r>
+        <w:rPr>
+          <w:b/>
+        </w:rPr>
+        <w:t xml:space="preserve">Still open</w:t>
+      </w:r>
+      <w:r>
+        <w:t xml:space="preserve"> are the entity name, terms of service, the </w:t>
+      </w:r>
+      <w:r>
+        <w:rPr>
+          <w:rFonts w:ascii="Consolas" w:hAnsi="Consolas"/>
+        </w:rPr>
+        <w:t xml:space="preserve">noindex</w:t>
+      </w:r>
+      <w:r>
+        <w:t xml:space="preserve"> decision on the intake pages, and the scoping-call bridge. Those are owner decisions, not build work.</w:t>
       </w:r>
     </w:p>
     <w:p>

</xml_diff>